<commit_message>
Melhoria do diagrama de classe
</commit_message>
<xml_diff>
--- a/docs/assets/docs/DOCUMENTO-DE-ARQUITETURA-DE-SOFTWARE.docx
+++ b/docs/assets/docs/DOCUMENTO-DE-ARQUITETURA-DE-SOFTWARE.docx
@@ -2706,7 +2706,7 @@
         </w:rPr>
         <w:fldChar w:fldCharType="separate"/>
       </w:r>
-      <w:hyperlink w:anchor="_Toc225289724" w:history="1">
+      <w:hyperlink w:anchor="_Toc226307814" w:history="1">
         <w:r>
           <w:rPr>
             <w:rStyle w:val="Hyperlink"/>
@@ -2741,7 +2741,7 @@
             <w:noProof/>
             <w:webHidden/>
           </w:rPr>
-          <w:instrText xml:space="preserve"> PAGEREF _Toc225289724 \h </w:instrText>
+          <w:instrText xml:space="preserve"> PAGEREF _Toc226307814 \h </w:instrText>
         </w:r>
         <w:r>
           <w:rPr>
@@ -2784,7 +2784,7 @@
           <w14:ligatures w14:val="standardContextual"/>
         </w:rPr>
       </w:pPr>
-      <w:hyperlink w:anchor="_Toc225289725" w:history="1">
+      <w:hyperlink w:anchor="_Toc226307815" w:history="1">
         <w:r>
           <w:rPr>
             <w:rStyle w:val="Hyperlink"/>
@@ -2811,7 +2811,7 @@
             <w:noProof/>
             <w:webHidden/>
           </w:rPr>
-          <w:instrText xml:space="preserve"> PAGEREF _Toc225289725 \h </w:instrText>
+          <w:instrText xml:space="preserve"> PAGEREF _Toc226307815 \h </w:instrText>
         </w:r>
         <w:r>
           <w:rPr>
@@ -2854,7 +2854,7 @@
           <w14:ligatures w14:val="standardContextual"/>
         </w:rPr>
       </w:pPr>
-      <w:hyperlink w:anchor="_Toc225289726" w:history="1">
+      <w:hyperlink w:anchor="_Toc226307816" w:history="1">
         <w:r>
           <w:rPr>
             <w:rStyle w:val="Hyperlink"/>
@@ -2881,7 +2881,7 @@
             <w:noProof/>
             <w:webHidden/>
           </w:rPr>
-          <w:instrText xml:space="preserve"> PAGEREF _Toc225289726 \h </w:instrText>
+          <w:instrText xml:space="preserve"> PAGEREF _Toc226307816 \h </w:instrText>
         </w:r>
         <w:r>
           <w:rPr>
@@ -2924,7 +2924,7 @@
           <w14:ligatures w14:val="standardContextual"/>
         </w:rPr>
       </w:pPr>
-      <w:hyperlink w:anchor="_Toc225289727" w:history="1">
+      <w:hyperlink w:anchor="_Toc226307817" w:history="1">
         <w:r>
           <w:rPr>
             <w:rStyle w:val="Hyperlink"/>
@@ -2951,7 +2951,7 @@
             <w:noProof/>
             <w:webHidden/>
           </w:rPr>
-          <w:instrText xml:space="preserve"> PAGEREF _Toc225289727 \h </w:instrText>
+          <w:instrText xml:space="preserve"> PAGEREF _Toc226307817 \h </w:instrText>
         </w:r>
         <w:r>
           <w:rPr>
@@ -2999,7 +2999,7 @@
           <w14:ligatures w14:val="standardContextual"/>
         </w:rPr>
       </w:pPr>
-      <w:hyperlink w:anchor="_Toc225289728" w:history="1">
+      <w:hyperlink w:anchor="_Toc226307818" w:history="1">
         <w:r>
           <w:rPr>
             <w:rStyle w:val="Hyperlink"/>
@@ -3026,7 +3026,7 @@
             <w:noProof/>
             <w:webHidden/>
           </w:rPr>
-          <w:instrText xml:space="preserve"> PAGEREF _Toc225289728 \h </w:instrText>
+          <w:instrText xml:space="preserve"> PAGEREF _Toc226307818 \h </w:instrText>
         </w:r>
         <w:r>
           <w:rPr>
@@ -3074,7 +3074,7 @@
           <w14:ligatures w14:val="standardContextual"/>
         </w:rPr>
       </w:pPr>
-      <w:hyperlink w:anchor="_Toc225289729" w:history="1">
+      <w:hyperlink w:anchor="_Toc226307819" w:history="1">
         <w:r>
           <w:rPr>
             <w:rStyle w:val="Hyperlink"/>
@@ -3101,7 +3101,7 @@
             <w:noProof/>
             <w:webHidden/>
           </w:rPr>
-          <w:instrText xml:space="preserve"> PAGEREF _Toc225289729 \h </w:instrText>
+          <w:instrText xml:space="preserve"> PAGEREF _Toc226307819 \h </w:instrText>
         </w:r>
         <w:r>
           <w:rPr>
@@ -3149,7 +3149,7 @@
           <w14:ligatures w14:val="standardContextual"/>
         </w:rPr>
       </w:pPr>
-      <w:hyperlink w:anchor="_Toc225289730" w:history="1">
+      <w:hyperlink w:anchor="_Toc226307820" w:history="1">
         <w:r>
           <w:rPr>
             <w:rStyle w:val="Hyperlink"/>
@@ -3176,7 +3176,7 @@
             <w:noProof/>
             <w:webHidden/>
           </w:rPr>
-          <w:instrText xml:space="preserve"> PAGEREF _Toc225289730 \h </w:instrText>
+          <w:instrText xml:space="preserve"> PAGEREF _Toc226307820 \h </w:instrText>
         </w:r>
         <w:r>
           <w:rPr>
@@ -3219,7 +3219,7 @@
           <w14:ligatures w14:val="standardContextual"/>
         </w:rPr>
       </w:pPr>
-      <w:hyperlink w:anchor="_Toc225289731" w:history="1">
+      <w:hyperlink w:anchor="_Toc226307821" w:history="1">
         <w:r>
           <w:rPr>
             <w:rStyle w:val="Hyperlink"/>
@@ -3255,7 +3255,7 @@
             <w:noProof/>
             <w:webHidden/>
           </w:rPr>
-          <w:instrText xml:space="preserve"> PAGEREF _Toc225289731 \h </w:instrText>
+          <w:instrText xml:space="preserve"> PAGEREF _Toc226307821 \h </w:instrText>
         </w:r>
         <w:r>
           <w:rPr>
@@ -3298,7 +3298,7 @@
           <w14:ligatures w14:val="standardContextual"/>
         </w:rPr>
       </w:pPr>
-      <w:hyperlink w:anchor="_Toc225289732" w:history="1">
+      <w:hyperlink w:anchor="_Toc226307822" w:history="1">
         <w:r>
           <w:rPr>
             <w:rStyle w:val="Hyperlink"/>
@@ -3334,7 +3334,7 @@
             <w:noProof/>
             <w:webHidden/>
           </w:rPr>
-          <w:instrText xml:space="preserve"> PAGEREF _Toc225289732 \h </w:instrText>
+          <w:instrText xml:space="preserve"> PAGEREF _Toc226307822 \h </w:instrText>
         </w:r>
         <w:r>
           <w:rPr>
@@ -3377,7 +3377,7 @@
           <w14:ligatures w14:val="standardContextual"/>
         </w:rPr>
       </w:pPr>
-      <w:hyperlink w:anchor="_Toc225289733" w:history="1">
+      <w:hyperlink w:anchor="_Toc226307823" w:history="1">
         <w:r>
           <w:rPr>
             <w:rStyle w:val="Hyperlink"/>
@@ -3413,7 +3413,7 @@
             <w:noProof/>
             <w:webHidden/>
           </w:rPr>
-          <w:instrText xml:space="preserve"> PAGEREF _Toc225289733 \h </w:instrText>
+          <w:instrText xml:space="preserve"> PAGEREF _Toc226307823 \h </w:instrText>
         </w:r>
         <w:r>
           <w:rPr>
@@ -3456,7 +3456,7 @@
           <w14:ligatures w14:val="standardContextual"/>
         </w:rPr>
       </w:pPr>
-      <w:hyperlink w:anchor="_Toc225289734" w:history="1">
+      <w:hyperlink w:anchor="_Toc226307824" w:history="1">
         <w:r>
           <w:rPr>
             <w:rStyle w:val="Hyperlink"/>
@@ -3492,7 +3492,7 @@
             <w:noProof/>
             <w:webHidden/>
           </w:rPr>
-          <w:instrText xml:space="preserve"> PAGEREF _Toc225289734 \h </w:instrText>
+          <w:instrText xml:space="preserve"> PAGEREF _Toc226307824 \h </w:instrText>
         </w:r>
         <w:r>
           <w:rPr>
@@ -3535,7 +3535,7 @@
           <w14:ligatures w14:val="standardContextual"/>
         </w:rPr>
       </w:pPr>
-      <w:hyperlink w:anchor="_Toc225289735" w:history="1">
+      <w:hyperlink w:anchor="_Toc226307825" w:history="1">
         <w:r>
           <w:rPr>
             <w:rStyle w:val="Hyperlink"/>
@@ -3571,7 +3571,7 @@
             <w:noProof/>
             <w:webHidden/>
           </w:rPr>
-          <w:instrText xml:space="preserve"> PAGEREF _Toc225289735 \h </w:instrText>
+          <w:instrText xml:space="preserve"> PAGEREF _Toc226307825 \h </w:instrText>
         </w:r>
         <w:r>
           <w:rPr>
@@ -3614,7 +3614,7 @@
           <w14:ligatures w14:val="standardContextual"/>
         </w:rPr>
       </w:pPr>
-      <w:hyperlink w:anchor="_Toc225289736" w:history="1">
+      <w:hyperlink w:anchor="_Toc226307826" w:history="1">
         <w:r>
           <w:rPr>
             <w:rStyle w:val="Hyperlink"/>
@@ -3650,7 +3650,7 @@
             <w:noProof/>
             <w:webHidden/>
           </w:rPr>
-          <w:instrText xml:space="preserve"> PAGEREF _Toc225289736 \h </w:instrText>
+          <w:instrText xml:space="preserve"> PAGEREF _Toc226307826 \h </w:instrText>
         </w:r>
         <w:r>
           <w:rPr>
@@ -3693,7 +3693,7 @@
           <w14:ligatures w14:val="standardContextual"/>
         </w:rPr>
       </w:pPr>
-      <w:hyperlink w:anchor="_Toc225289737" w:history="1">
+      <w:hyperlink w:anchor="_Toc226307827" w:history="1">
         <w:r>
           <w:rPr>
             <w:rStyle w:val="Hyperlink"/>
@@ -3729,7 +3729,7 @@
             <w:noProof/>
             <w:webHidden/>
           </w:rPr>
-          <w:instrText xml:space="preserve"> PAGEREF _Toc225289737 \h </w:instrText>
+          <w:instrText xml:space="preserve"> PAGEREF _Toc226307827 \h </w:instrText>
         </w:r>
         <w:r>
           <w:rPr>
@@ -3777,7 +3777,7 @@
           <w14:ligatures w14:val="standardContextual"/>
         </w:rPr>
       </w:pPr>
-      <w:hyperlink w:anchor="_Toc225289738" w:history="1">
+      <w:hyperlink w:anchor="_Toc226307828" w:history="1">
         <w:r>
           <w:rPr>
             <w:rStyle w:val="Hyperlink"/>
@@ -3804,7 +3804,7 @@
             <w:noProof/>
             <w:webHidden/>
           </w:rPr>
-          <w:instrText xml:space="preserve"> PAGEREF _Toc225289738 \h </w:instrText>
+          <w:instrText xml:space="preserve"> PAGEREF _Toc226307828 \h </w:instrText>
         </w:r>
         <w:r>
           <w:rPr>
@@ -3847,7 +3847,7 @@
           <w14:ligatures w14:val="standardContextual"/>
         </w:rPr>
       </w:pPr>
-      <w:hyperlink w:anchor="_Toc225289739" w:history="1">
+      <w:hyperlink w:anchor="_Toc226307829" w:history="1">
         <w:r>
           <w:rPr>
             <w:rStyle w:val="Hyperlink"/>
@@ -3883,7 +3883,147 @@
             <w:noProof/>
             <w:webHidden/>
           </w:rPr>
-          <w:instrText xml:space="preserve"> PAGEREF _Toc225289739 \h </w:instrText>
+          <w:instrText xml:space="preserve"> PAGEREF _Toc226307829 \h </w:instrText>
+        </w:r>
+        <w:r>
+          <w:rPr>
+            <w:noProof/>
+            <w:webHidden/>
+          </w:rPr>
+        </w:r>
+        <w:r>
+          <w:rPr>
+            <w:noProof/>
+            <w:webHidden/>
+          </w:rPr>
+          <w:fldChar w:fldCharType="separate"/>
+        </w:r>
+        <w:r>
+          <w:rPr>
+            <w:noProof/>
+            <w:webHidden/>
+          </w:rPr>
+          <w:t>14</w:t>
+        </w:r>
+        <w:r>
+          <w:rPr>
+            <w:noProof/>
+            <w:webHidden/>
+          </w:rPr>
+          <w:fldChar w:fldCharType="end"/>
+        </w:r>
+      </w:hyperlink>
+    </w:p>
+    <w:p>
+      <w:pPr>
+        <w:pStyle w:val="Sumrio2"/>
+        <w:rPr>
+          <w:rFonts w:asciiTheme="minorHAnsi" w:hAnsiTheme="minorHAnsi"/>
+          <w:noProof/>
+          <w:kern w:val="2"/>
+          <w:szCs w:val="24"/>
+          <w:lang w:val="pt-BR" w:eastAsia="pt-BR"/>
+          <w14:ligatures w14:val="standardContextual"/>
+        </w:rPr>
+      </w:pPr>
+      <w:hyperlink w:anchor="_Toc226307830" w:history="1">
+        <w:r>
+          <w:rPr>
+            <w:rStyle w:val="Hyperlink"/>
+            <w:noProof/>
+          </w:rPr>
+          <w:t>5.2 Módulo de Renderização</w:t>
+        </w:r>
+        <w:r>
+          <w:rPr>
+            <w:noProof/>
+            <w:webHidden/>
+          </w:rPr>
+          <w:tab/>
+        </w:r>
+        <w:r>
+          <w:rPr>
+            <w:noProof/>
+            <w:webHidden/>
+          </w:rPr>
+          <w:fldChar w:fldCharType="begin"/>
+        </w:r>
+        <w:r>
+          <w:rPr>
+            <w:noProof/>
+            <w:webHidden/>
+          </w:rPr>
+          <w:instrText xml:space="preserve"> PAGEREF _Toc226307830 \h </w:instrText>
+        </w:r>
+        <w:r>
+          <w:rPr>
+            <w:noProof/>
+            <w:webHidden/>
+          </w:rPr>
+        </w:r>
+        <w:r>
+          <w:rPr>
+            <w:noProof/>
+            <w:webHidden/>
+          </w:rPr>
+          <w:fldChar w:fldCharType="separate"/>
+        </w:r>
+        <w:r>
+          <w:rPr>
+            <w:noProof/>
+            <w:webHidden/>
+          </w:rPr>
+          <w:t>14</w:t>
+        </w:r>
+        <w:r>
+          <w:rPr>
+            <w:noProof/>
+            <w:webHidden/>
+          </w:rPr>
+          <w:fldChar w:fldCharType="end"/>
+        </w:r>
+      </w:hyperlink>
+    </w:p>
+    <w:p>
+      <w:pPr>
+        <w:pStyle w:val="Sumrio2"/>
+        <w:rPr>
+          <w:rFonts w:asciiTheme="minorHAnsi" w:hAnsiTheme="minorHAnsi"/>
+          <w:noProof/>
+          <w:kern w:val="2"/>
+          <w:szCs w:val="24"/>
+          <w:lang w:val="pt-BR" w:eastAsia="pt-BR"/>
+          <w14:ligatures w14:val="standardContextual"/>
+        </w:rPr>
+      </w:pPr>
+      <w:hyperlink w:anchor="_Toc226307831" w:history="1">
+        <w:r>
+          <w:rPr>
+            <w:rStyle w:val="Hyperlink"/>
+            <w:noProof/>
+          </w:rPr>
+          <w:t>5.3 Módulo de Entidades</w:t>
+        </w:r>
+        <w:r>
+          <w:rPr>
+            <w:noProof/>
+            <w:webHidden/>
+          </w:rPr>
+          <w:tab/>
+        </w:r>
+        <w:r>
+          <w:rPr>
+            <w:noProof/>
+            <w:webHidden/>
+          </w:rPr>
+          <w:fldChar w:fldCharType="begin"/>
+        </w:r>
+        <w:r>
+          <w:rPr>
+            <w:noProof/>
+            <w:webHidden/>
+          </w:rPr>
+          <w:instrText xml:space="preserve"> PAGEREF _Toc226307831 \h </w:instrText>
         </w:r>
         <w:r>
           <w:rPr>
@@ -3926,13 +4066,13 @@
           <w14:ligatures w14:val="standardContextual"/>
         </w:rPr>
       </w:pPr>
-      <w:hyperlink w:anchor="_Toc225289740" w:history="1">
+      <w:hyperlink w:anchor="_Toc226307832" w:history="1">
         <w:r>
           <w:rPr>
             <w:rStyle w:val="Hyperlink"/>
             <w:noProof/>
           </w:rPr>
-          <w:t>5.2 Módulo de Renderização</w:t>
+          <w:t>5.4 Módulo de Colisão</w:t>
         </w:r>
         <w:r>
           <w:rPr>
@@ -3953,7 +4093,7 @@
             <w:noProof/>
             <w:webHidden/>
           </w:rPr>
-          <w:instrText xml:space="preserve"> PAGEREF _Toc225289740 \h </w:instrText>
+          <w:instrText xml:space="preserve"> PAGEREF _Toc226307832 \h </w:instrText>
         </w:r>
         <w:r>
           <w:rPr>
@@ -3996,13 +4136,13 @@
           <w14:ligatures w14:val="standardContextual"/>
         </w:rPr>
       </w:pPr>
-      <w:hyperlink w:anchor="_Toc225289741" w:history="1">
+      <w:hyperlink w:anchor="_Toc226307833" w:history="1">
         <w:r>
           <w:rPr>
             <w:rStyle w:val="Hyperlink"/>
             <w:noProof/>
           </w:rPr>
-          <w:t>5.3 Módulo de Entidades</w:t>
+          <w:t>5.5 Módulo de Entrada</w:t>
         </w:r>
         <w:r>
           <w:rPr>
@@ -4023,7 +4163,7 @@
             <w:noProof/>
             <w:webHidden/>
           </w:rPr>
-          <w:instrText xml:space="preserve"> PAGEREF _Toc225289741 \h </w:instrText>
+          <w:instrText xml:space="preserve"> PAGEREF _Toc226307833 \h </w:instrText>
         </w:r>
         <w:r>
           <w:rPr>
@@ -4066,13 +4206,13 @@
           <w14:ligatures w14:val="standardContextual"/>
         </w:rPr>
       </w:pPr>
-      <w:hyperlink w:anchor="_Toc225289742" w:history="1">
+      <w:hyperlink w:anchor="_Toc226307834" w:history="1">
         <w:r>
           <w:rPr>
             <w:rStyle w:val="Hyperlink"/>
             <w:noProof/>
           </w:rPr>
-          <w:t>5.4 Módulo de Colisão</w:t>
+          <w:t>5.6 Módulo de Gerenciamento de Recursos</w:t>
         </w:r>
         <w:r>
           <w:rPr>
@@ -4093,7 +4233,7 @@
             <w:noProof/>
             <w:webHidden/>
           </w:rPr>
-          <w:instrText xml:space="preserve"> PAGEREF _Toc225289742 \h </w:instrText>
+          <w:instrText xml:space="preserve"> PAGEREF _Toc226307834 \h </w:instrText>
         </w:r>
         <w:r>
           <w:rPr>
@@ -4136,13 +4276,13 @@
           <w14:ligatures w14:val="standardContextual"/>
         </w:rPr>
       </w:pPr>
-      <w:hyperlink w:anchor="_Toc225289743" w:history="1">
+      <w:hyperlink w:anchor="_Toc226307835" w:history="1">
         <w:r>
           <w:rPr>
             <w:rStyle w:val="Hyperlink"/>
             <w:noProof/>
           </w:rPr>
-          <w:t>5.5 Módulo de Entrada</w:t>
+          <w:t>5.7 Módulo de Gerenciamento de Cenas</w:t>
         </w:r>
         <w:r>
           <w:rPr>
@@ -4163,7 +4303,7 @@
             <w:noProof/>
             <w:webHidden/>
           </w:rPr>
-          <w:instrText xml:space="preserve"> PAGEREF _Toc225289743 \h </w:instrText>
+          <w:instrText xml:space="preserve"> PAGEREF _Toc226307835 \h </w:instrText>
         </w:r>
         <w:r>
           <w:rPr>
@@ -4196,146 +4336,6 @@
     </w:p>
     <w:p>
       <w:pPr>
-        <w:pStyle w:val="Sumrio2"/>
-        <w:rPr>
-          <w:rFonts w:asciiTheme="minorHAnsi" w:hAnsiTheme="minorHAnsi"/>
-          <w:noProof/>
-          <w:kern w:val="2"/>
-          <w:szCs w:val="24"/>
-          <w:lang w:val="pt-BR" w:eastAsia="pt-BR"/>
-          <w14:ligatures w14:val="standardContextual"/>
-        </w:rPr>
-      </w:pPr>
-      <w:hyperlink w:anchor="_Toc225289744" w:history="1">
-        <w:r>
-          <w:rPr>
-            <w:rStyle w:val="Hyperlink"/>
-            <w:noProof/>
-          </w:rPr>
-          <w:t>5.6 Módulo de Gerenciamento de Recursos</w:t>
-        </w:r>
-        <w:r>
-          <w:rPr>
-            <w:noProof/>
-            <w:webHidden/>
-          </w:rPr>
-          <w:tab/>
-        </w:r>
-        <w:r>
-          <w:rPr>
-            <w:noProof/>
-            <w:webHidden/>
-          </w:rPr>
-          <w:fldChar w:fldCharType="begin"/>
-        </w:r>
-        <w:r>
-          <w:rPr>
-            <w:noProof/>
-            <w:webHidden/>
-          </w:rPr>
-          <w:instrText xml:space="preserve"> PAGEREF _Toc225289744 \h </w:instrText>
-        </w:r>
-        <w:r>
-          <w:rPr>
-            <w:noProof/>
-            <w:webHidden/>
-          </w:rPr>
-        </w:r>
-        <w:r>
-          <w:rPr>
-            <w:noProof/>
-            <w:webHidden/>
-          </w:rPr>
-          <w:fldChar w:fldCharType="separate"/>
-        </w:r>
-        <w:r>
-          <w:rPr>
-            <w:noProof/>
-            <w:webHidden/>
-          </w:rPr>
-          <w:t>17</w:t>
-        </w:r>
-        <w:r>
-          <w:rPr>
-            <w:noProof/>
-            <w:webHidden/>
-          </w:rPr>
-          <w:fldChar w:fldCharType="end"/>
-        </w:r>
-      </w:hyperlink>
-    </w:p>
-    <w:p>
-      <w:pPr>
-        <w:pStyle w:val="Sumrio2"/>
-        <w:rPr>
-          <w:rFonts w:asciiTheme="minorHAnsi" w:hAnsiTheme="minorHAnsi"/>
-          <w:noProof/>
-          <w:kern w:val="2"/>
-          <w:szCs w:val="24"/>
-          <w:lang w:val="pt-BR" w:eastAsia="pt-BR"/>
-          <w14:ligatures w14:val="standardContextual"/>
-        </w:rPr>
-      </w:pPr>
-      <w:hyperlink w:anchor="_Toc225289745" w:history="1">
-        <w:r>
-          <w:rPr>
-            <w:rStyle w:val="Hyperlink"/>
-            <w:noProof/>
-          </w:rPr>
-          <w:t>5.7 Módulo de Gerenciamento de Cenas</w:t>
-        </w:r>
-        <w:r>
-          <w:rPr>
-            <w:noProof/>
-            <w:webHidden/>
-          </w:rPr>
-          <w:tab/>
-        </w:r>
-        <w:r>
-          <w:rPr>
-            <w:noProof/>
-            <w:webHidden/>
-          </w:rPr>
-          <w:fldChar w:fldCharType="begin"/>
-        </w:r>
-        <w:r>
-          <w:rPr>
-            <w:noProof/>
-            <w:webHidden/>
-          </w:rPr>
-          <w:instrText xml:space="preserve"> PAGEREF _Toc225289745 \h </w:instrText>
-        </w:r>
-        <w:r>
-          <w:rPr>
-            <w:noProof/>
-            <w:webHidden/>
-          </w:rPr>
-        </w:r>
-        <w:r>
-          <w:rPr>
-            <w:noProof/>
-            <w:webHidden/>
-          </w:rPr>
-          <w:fldChar w:fldCharType="separate"/>
-        </w:r>
-        <w:r>
-          <w:rPr>
-            <w:noProof/>
-            <w:webHidden/>
-          </w:rPr>
-          <w:t>18</w:t>
-        </w:r>
-        <w:r>
-          <w:rPr>
-            <w:noProof/>
-            <w:webHidden/>
-          </w:rPr>
-          <w:fldChar w:fldCharType="end"/>
-        </w:r>
-      </w:hyperlink>
-    </w:p>
-    <w:p>
-      <w:pPr>
         <w:pStyle w:val="Sumrio1"/>
         <w:tabs>
           <w:tab w:val="right" w:leader="dot" w:pos="9062"/>
@@ -4351,7 +4351,7 @@
           <w14:ligatures w14:val="standardContextual"/>
         </w:rPr>
       </w:pPr>
-      <w:hyperlink w:anchor="_Toc225289746" w:history="1">
+      <w:hyperlink w:anchor="_Toc226307836" w:history="1">
         <w:r>
           <w:rPr>
             <w:rStyle w:val="Hyperlink"/>
@@ -4387,7 +4387,147 @@
             <w:noProof/>
             <w:webHidden/>
           </w:rPr>
-          <w:instrText xml:space="preserve"> PAGEREF _Toc225289746 \h </w:instrText>
+          <w:instrText xml:space="preserve"> PAGEREF _Toc226307836 \h </w:instrText>
+        </w:r>
+        <w:r>
+          <w:rPr>
+            <w:noProof/>
+            <w:webHidden/>
+          </w:rPr>
+        </w:r>
+        <w:r>
+          <w:rPr>
+            <w:noProof/>
+            <w:webHidden/>
+          </w:rPr>
+          <w:fldChar w:fldCharType="separate"/>
+        </w:r>
+        <w:r>
+          <w:rPr>
+            <w:noProof/>
+            <w:webHidden/>
+          </w:rPr>
+          <w:t>18</w:t>
+        </w:r>
+        <w:r>
+          <w:rPr>
+            <w:noProof/>
+            <w:webHidden/>
+          </w:rPr>
+          <w:fldChar w:fldCharType="end"/>
+        </w:r>
+      </w:hyperlink>
+    </w:p>
+    <w:p>
+      <w:pPr>
+        <w:pStyle w:val="Sumrio2"/>
+        <w:rPr>
+          <w:rFonts w:asciiTheme="minorHAnsi" w:hAnsiTheme="minorHAnsi"/>
+          <w:noProof/>
+          <w:kern w:val="2"/>
+          <w:szCs w:val="24"/>
+          <w:lang w:val="pt-BR" w:eastAsia="pt-BR"/>
+          <w14:ligatures w14:val="standardContextual"/>
+        </w:rPr>
+      </w:pPr>
+      <w:hyperlink w:anchor="_Toc226307837" w:history="1">
+        <w:r>
+          <w:rPr>
+            <w:rStyle w:val="Hyperlink"/>
+            <w:noProof/>
+          </w:rPr>
+          <w:t>6.1 Inicialização do Sistema</w:t>
+        </w:r>
+        <w:r>
+          <w:rPr>
+            <w:noProof/>
+            <w:webHidden/>
+          </w:rPr>
+          <w:tab/>
+        </w:r>
+        <w:r>
+          <w:rPr>
+            <w:noProof/>
+            <w:webHidden/>
+          </w:rPr>
+          <w:fldChar w:fldCharType="begin"/>
+        </w:r>
+        <w:r>
+          <w:rPr>
+            <w:noProof/>
+            <w:webHidden/>
+          </w:rPr>
+          <w:instrText xml:space="preserve"> PAGEREF _Toc226307837 \h </w:instrText>
+        </w:r>
+        <w:r>
+          <w:rPr>
+            <w:noProof/>
+            <w:webHidden/>
+          </w:rPr>
+        </w:r>
+        <w:r>
+          <w:rPr>
+            <w:noProof/>
+            <w:webHidden/>
+          </w:rPr>
+          <w:fldChar w:fldCharType="separate"/>
+        </w:r>
+        <w:r>
+          <w:rPr>
+            <w:noProof/>
+            <w:webHidden/>
+          </w:rPr>
+          <w:t>18</w:t>
+        </w:r>
+        <w:r>
+          <w:rPr>
+            <w:noProof/>
+            <w:webHidden/>
+          </w:rPr>
+          <w:fldChar w:fldCharType="end"/>
+        </w:r>
+      </w:hyperlink>
+    </w:p>
+    <w:p>
+      <w:pPr>
+        <w:pStyle w:val="Sumrio2"/>
+        <w:rPr>
+          <w:rFonts w:asciiTheme="minorHAnsi" w:hAnsiTheme="minorHAnsi"/>
+          <w:noProof/>
+          <w:kern w:val="2"/>
+          <w:szCs w:val="24"/>
+          <w:lang w:val="pt-BR" w:eastAsia="pt-BR"/>
+          <w14:ligatures w14:val="standardContextual"/>
+        </w:rPr>
+      </w:pPr>
+      <w:hyperlink w:anchor="_Toc226307838" w:history="1">
+        <w:r>
+          <w:rPr>
+            <w:rStyle w:val="Hyperlink"/>
+            <w:noProof/>
+          </w:rPr>
+          <w:t>6.2 Processamento de Entrada</w:t>
+        </w:r>
+        <w:r>
+          <w:rPr>
+            <w:noProof/>
+            <w:webHidden/>
+          </w:rPr>
+          <w:tab/>
+        </w:r>
+        <w:r>
+          <w:rPr>
+            <w:noProof/>
+            <w:webHidden/>
+          </w:rPr>
+          <w:fldChar w:fldCharType="begin"/>
+        </w:r>
+        <w:r>
+          <w:rPr>
+            <w:noProof/>
+            <w:webHidden/>
+          </w:rPr>
+          <w:instrText xml:space="preserve"> PAGEREF _Toc226307838 \h </w:instrText>
         </w:r>
         <w:r>
           <w:rPr>
@@ -4430,13 +4570,13 @@
           <w14:ligatures w14:val="standardContextual"/>
         </w:rPr>
       </w:pPr>
-      <w:hyperlink w:anchor="_Toc225289747" w:history="1">
+      <w:hyperlink w:anchor="_Toc226307839" w:history="1">
         <w:r>
           <w:rPr>
             <w:rStyle w:val="Hyperlink"/>
             <w:noProof/>
           </w:rPr>
-          <w:t>6.1 Inicialização do Sistema</w:t>
+          <w:t>6.3 Atualização da Lógica do Jogo</w:t>
         </w:r>
         <w:r>
           <w:rPr>
@@ -4457,7 +4597,7 @@
             <w:noProof/>
             <w:webHidden/>
           </w:rPr>
-          <w:instrText xml:space="preserve"> PAGEREF _Toc225289747 \h </w:instrText>
+          <w:instrText xml:space="preserve"> PAGEREF _Toc226307839 \h </w:instrText>
         </w:r>
         <w:r>
           <w:rPr>
@@ -4500,13 +4640,13 @@
           <w14:ligatures w14:val="standardContextual"/>
         </w:rPr>
       </w:pPr>
-      <w:hyperlink w:anchor="_Toc225289748" w:history="1">
+      <w:hyperlink w:anchor="_Toc226307840" w:history="1">
         <w:r>
           <w:rPr>
             <w:rStyle w:val="Hyperlink"/>
             <w:noProof/>
           </w:rPr>
-          <w:t>6.2 Processamento de Entrada</w:t>
+          <w:t>6.4 Detecção de Colisões</w:t>
         </w:r>
         <w:r>
           <w:rPr>
@@ -4527,7 +4667,7 @@
             <w:noProof/>
             <w:webHidden/>
           </w:rPr>
-          <w:instrText xml:space="preserve"> PAGEREF _Toc225289748 \h </w:instrText>
+          <w:instrText xml:space="preserve"> PAGEREF _Toc226307840 \h </w:instrText>
         </w:r>
         <w:r>
           <w:rPr>
@@ -4570,13 +4710,13 @@
           <w14:ligatures w14:val="standardContextual"/>
         </w:rPr>
       </w:pPr>
-      <w:hyperlink w:anchor="_Toc225289749" w:history="1">
+      <w:hyperlink w:anchor="_Toc226307841" w:history="1">
         <w:r>
           <w:rPr>
             <w:rStyle w:val="Hyperlink"/>
             <w:noProof/>
           </w:rPr>
-          <w:t>6.3 Atualização da Lógica do Jogo</w:t>
+          <w:t>6.5 Renderização da Cena</w:t>
         </w:r>
         <w:r>
           <w:rPr>
@@ -4597,7 +4737,7 @@
             <w:noProof/>
             <w:webHidden/>
           </w:rPr>
-          <w:instrText xml:space="preserve"> PAGEREF _Toc225289749 \h </w:instrText>
+          <w:instrText xml:space="preserve"> PAGEREF _Toc226307841 \h </w:instrText>
         </w:r>
         <w:r>
           <w:rPr>
@@ -4640,13 +4780,13 @@
           <w14:ligatures w14:val="standardContextual"/>
         </w:rPr>
       </w:pPr>
-      <w:hyperlink w:anchor="_Toc225289750" w:history="1">
+      <w:hyperlink w:anchor="_Toc226307842" w:history="1">
         <w:r>
           <w:rPr>
             <w:rStyle w:val="Hyperlink"/>
             <w:noProof/>
           </w:rPr>
-          <w:t>6.4 Detecção de Colisões</w:t>
+          <w:t>6.6 Encerramento da Aplicação</w:t>
         </w:r>
         <w:r>
           <w:rPr>
@@ -4667,7 +4807,7 @@
             <w:noProof/>
             <w:webHidden/>
           </w:rPr>
-          <w:instrText xml:space="preserve"> PAGEREF _Toc225289750 \h </w:instrText>
+          <w:instrText xml:space="preserve"> PAGEREF _Toc226307842 \h </w:instrText>
         </w:r>
         <w:r>
           <w:rPr>
@@ -4700,23 +4840,28 @@
     </w:p>
     <w:p>
       <w:pPr>
-        <w:pStyle w:val="Sumrio2"/>
+        <w:pStyle w:val="Sumrio1"/>
+        <w:tabs>
+          <w:tab w:val="right" w:leader="dot" w:pos="9062"/>
+        </w:tabs>
         <w:rPr>
           <w:rFonts w:asciiTheme="minorHAnsi" w:hAnsiTheme="minorHAnsi"/>
+          <w:b w:val="0"/>
           <w:noProof/>
           <w:kern w:val="2"/>
+          <w:sz w:val="24"/>
           <w:szCs w:val="24"/>
           <w:lang w:val="pt-BR" w:eastAsia="pt-BR"/>
           <w14:ligatures w14:val="standardContextual"/>
         </w:rPr>
       </w:pPr>
-      <w:hyperlink w:anchor="_Toc225289751" w:history="1">
+      <w:hyperlink w:anchor="_Toc226307843" w:history="1">
         <w:r>
           <w:rPr>
             <w:rStyle w:val="Hyperlink"/>
             <w:noProof/>
           </w:rPr>
-          <w:t>6.5 Renderização da Cena</w:t>
+          <w:t>7 Diagramas</w:t>
         </w:r>
         <w:r>
           <w:rPr>
@@ -4737,7 +4882,77 @@
             <w:noProof/>
             <w:webHidden/>
           </w:rPr>
-          <w:instrText xml:space="preserve"> PAGEREF _Toc225289751 \h </w:instrText>
+          <w:instrText xml:space="preserve"> PAGEREF _Toc226307843 \h </w:instrText>
+        </w:r>
+        <w:r>
+          <w:rPr>
+            <w:noProof/>
+            <w:webHidden/>
+          </w:rPr>
+        </w:r>
+        <w:r>
+          <w:rPr>
+            <w:noProof/>
+            <w:webHidden/>
+          </w:rPr>
+          <w:fldChar w:fldCharType="separate"/>
+        </w:r>
+        <w:r>
+          <w:rPr>
+            <w:noProof/>
+            <w:webHidden/>
+          </w:rPr>
+          <w:t>20</w:t>
+        </w:r>
+        <w:r>
+          <w:rPr>
+            <w:noProof/>
+            <w:webHidden/>
+          </w:rPr>
+          <w:fldChar w:fldCharType="end"/>
+        </w:r>
+      </w:hyperlink>
+    </w:p>
+    <w:p>
+      <w:pPr>
+        <w:pStyle w:val="Sumrio2"/>
+        <w:rPr>
+          <w:rFonts w:asciiTheme="minorHAnsi" w:hAnsiTheme="minorHAnsi"/>
+          <w:noProof/>
+          <w:kern w:val="2"/>
+          <w:szCs w:val="24"/>
+          <w:lang w:val="pt-BR" w:eastAsia="pt-BR"/>
+          <w14:ligatures w14:val="standardContextual"/>
+        </w:rPr>
+      </w:pPr>
+      <w:hyperlink w:anchor="_Toc226307844" w:history="1">
+        <w:r>
+          <w:rPr>
+            <w:rStyle w:val="Hyperlink"/>
+            <w:noProof/>
+          </w:rPr>
+          <w:t>7.1 Caso de Uso</w:t>
+        </w:r>
+        <w:r>
+          <w:rPr>
+            <w:noProof/>
+            <w:webHidden/>
+          </w:rPr>
+          <w:tab/>
+        </w:r>
+        <w:r>
+          <w:rPr>
+            <w:noProof/>
+            <w:webHidden/>
+          </w:rPr>
+          <w:fldChar w:fldCharType="begin"/>
+        </w:r>
+        <w:r>
+          <w:rPr>
+            <w:noProof/>
+            <w:webHidden/>
+          </w:rPr>
+          <w:instrText xml:space="preserve"> PAGEREF _Toc226307844 \h </w:instrText>
         </w:r>
         <w:r>
           <w:rPr>
@@ -4780,13 +4995,13 @@
           <w14:ligatures w14:val="standardContextual"/>
         </w:rPr>
       </w:pPr>
-      <w:hyperlink w:anchor="_Toc225289752" w:history="1">
+      <w:hyperlink w:anchor="_Toc226307845" w:history="1">
         <w:r>
           <w:rPr>
             <w:rStyle w:val="Hyperlink"/>
             <w:noProof/>
           </w:rPr>
-          <w:t>6.6 Encerramento da Aplicação</w:t>
+          <w:t>7.1 Classe e Relacionamento</w:t>
         </w:r>
         <w:r>
           <w:rPr>
@@ -4807,7 +5022,7 @@
             <w:noProof/>
             <w:webHidden/>
           </w:rPr>
-          <w:instrText xml:space="preserve"> PAGEREF _Toc225289752 \h </w:instrText>
+          <w:instrText xml:space="preserve"> PAGEREF _Toc226307845 \h </w:instrText>
         </w:r>
         <w:r>
           <w:rPr>
@@ -4840,151 +5055,6 @@
     </w:p>
     <w:p>
       <w:pPr>
-        <w:pStyle w:val="Sumrio1"/>
-        <w:tabs>
-          <w:tab w:val="right" w:leader="dot" w:pos="9062"/>
-        </w:tabs>
-        <w:rPr>
-          <w:rFonts w:asciiTheme="minorHAnsi" w:hAnsiTheme="minorHAnsi"/>
-          <w:b w:val="0"/>
-          <w:noProof/>
-          <w:kern w:val="2"/>
-          <w:sz w:val="24"/>
-          <w:szCs w:val="24"/>
-          <w:lang w:val="pt-BR" w:eastAsia="pt-BR"/>
-          <w14:ligatures w14:val="standardContextual"/>
-        </w:rPr>
-      </w:pPr>
-      <w:hyperlink w:anchor="_Toc225289753" w:history="1">
-        <w:r>
-          <w:rPr>
-            <w:rStyle w:val="Hyperlink"/>
-            <w:noProof/>
-          </w:rPr>
-          <w:t>7 Diagramas</w:t>
-        </w:r>
-        <w:r>
-          <w:rPr>
-            <w:noProof/>
-            <w:webHidden/>
-          </w:rPr>
-          <w:tab/>
-        </w:r>
-        <w:r>
-          <w:rPr>
-            <w:noProof/>
-            <w:webHidden/>
-          </w:rPr>
-          <w:fldChar w:fldCharType="begin"/>
-        </w:r>
-        <w:r>
-          <w:rPr>
-            <w:noProof/>
-            <w:webHidden/>
-          </w:rPr>
-          <w:instrText xml:space="preserve"> PAGEREF _Toc225289753 \h </w:instrText>
-        </w:r>
-        <w:r>
-          <w:rPr>
-            <w:noProof/>
-            <w:webHidden/>
-          </w:rPr>
-        </w:r>
-        <w:r>
-          <w:rPr>
-            <w:noProof/>
-            <w:webHidden/>
-          </w:rPr>
-          <w:fldChar w:fldCharType="separate"/>
-        </w:r>
-        <w:r>
-          <w:rPr>
-            <w:noProof/>
-            <w:webHidden/>
-          </w:rPr>
-          <w:t>21</w:t>
-        </w:r>
-        <w:r>
-          <w:rPr>
-            <w:noProof/>
-            <w:webHidden/>
-          </w:rPr>
-          <w:fldChar w:fldCharType="end"/>
-        </w:r>
-      </w:hyperlink>
-    </w:p>
-    <w:p>
-      <w:pPr>
-        <w:pStyle w:val="Sumrio2"/>
-        <w:rPr>
-          <w:rFonts w:asciiTheme="minorHAnsi" w:hAnsiTheme="minorHAnsi"/>
-          <w:noProof/>
-          <w:kern w:val="2"/>
-          <w:szCs w:val="24"/>
-          <w:lang w:val="pt-BR" w:eastAsia="pt-BR"/>
-          <w14:ligatures w14:val="standardContextual"/>
-        </w:rPr>
-      </w:pPr>
-      <w:hyperlink w:anchor="_Toc225289754" w:history="1">
-        <w:r>
-          <w:rPr>
-            <w:rStyle w:val="Hyperlink"/>
-            <w:noProof/>
-          </w:rPr>
-          <w:t>7.1 Caso de Uso</w:t>
-        </w:r>
-        <w:r>
-          <w:rPr>
-            <w:noProof/>
-            <w:webHidden/>
-          </w:rPr>
-          <w:tab/>
-        </w:r>
-        <w:r>
-          <w:rPr>
-            <w:noProof/>
-            <w:webHidden/>
-          </w:rPr>
-          <w:fldChar w:fldCharType="begin"/>
-        </w:r>
-        <w:r>
-          <w:rPr>
-            <w:noProof/>
-            <w:webHidden/>
-          </w:rPr>
-          <w:instrText xml:space="preserve"> PAGEREF _Toc225289754 \h </w:instrText>
-        </w:r>
-        <w:r>
-          <w:rPr>
-            <w:noProof/>
-            <w:webHidden/>
-          </w:rPr>
-        </w:r>
-        <w:r>
-          <w:rPr>
-            <w:noProof/>
-            <w:webHidden/>
-          </w:rPr>
-          <w:fldChar w:fldCharType="separate"/>
-        </w:r>
-        <w:r>
-          <w:rPr>
-            <w:noProof/>
-            <w:webHidden/>
-          </w:rPr>
-          <w:t>21</w:t>
-        </w:r>
-        <w:r>
-          <w:rPr>
-            <w:noProof/>
-            <w:webHidden/>
-          </w:rPr>
-          <w:fldChar w:fldCharType="end"/>
-        </w:r>
-      </w:hyperlink>
-    </w:p>
-    <w:p>
-      <w:pPr>
         <w:ind w:right="160" w:firstLine="0"/>
         <w:rPr>
           <w:rFonts w:ascii="Arial" w:eastAsia="Arial" w:hAnsi="Arial"/>
@@ -5024,7 +5094,7 @@
           <w:rFonts w:cs="Arial"/>
         </w:rPr>
       </w:pPr>
-      <w:bookmarkStart w:id="0" w:name="_Toc225289724"/>
+      <w:bookmarkStart w:id="0" w:name="_Toc226307814"/>
       <w:r>
         <w:rPr>
           <w:rFonts w:cs="Arial"/>
@@ -5055,7 +5125,7 @@
       <w:pPr>
         <w:pStyle w:val="Ttulo2"/>
       </w:pPr>
-      <w:bookmarkStart w:id="1" w:name="_Toc225289725"/>
+      <w:bookmarkStart w:id="1" w:name="_Toc226307815"/>
       <w:r>
         <w:t xml:space="preserve">1.1 </w:t>
       </w:r>
@@ -6061,7 +6131,7 @@
       <w:pPr>
         <w:pStyle w:val="Ttulo2"/>
       </w:pPr>
-      <w:bookmarkStart w:id="2" w:name="_Toc225289726"/>
+      <w:bookmarkStart w:id="2" w:name="_Toc226307816"/>
       <w:r>
         <w:t xml:space="preserve">1.2 </w:t>
       </w:r>
@@ -7092,7 +7162,7 @@
       <w:pPr>
         <w:pStyle w:val="Ttulo2"/>
       </w:pPr>
-      <w:bookmarkStart w:id="3" w:name="_Toc225289727"/>
+      <w:bookmarkStart w:id="3" w:name="_Toc226307817"/>
       <w:r>
         <w:t xml:space="preserve">1.3 </w:t>
       </w:r>
@@ -7737,7 +7807,7 @@
       <w:pPr>
         <w:pStyle w:val="Ttulo1"/>
       </w:pPr>
-      <w:bookmarkStart w:id="4" w:name="_Toc225289728"/>
+      <w:bookmarkStart w:id="4" w:name="_Toc226307818"/>
       <w:r>
         <w:t>2 VISÃO GERAL DA ARQUITETURA</w:t>
       </w:r>
@@ -11089,7 +11159,7 @@
       <w:pPr>
         <w:pStyle w:val="Ttulo1"/>
       </w:pPr>
-      <w:bookmarkStart w:id="5" w:name="_Toc225289729"/>
+      <w:bookmarkStart w:id="5" w:name="_Toc226307819"/>
       <w:r>
         <w:t>3 ESTILO ARQUITETURAL</w:t>
       </w:r>
@@ -14286,7 +14356,7 @@
       <w:pPr>
         <w:pStyle w:val="Ttulo1"/>
       </w:pPr>
-      <w:bookmarkStart w:id="6" w:name="_Toc225289730"/>
+      <w:bookmarkStart w:id="6" w:name="_Toc226307820"/>
       <w:r>
         <w:t>4 COMPONENTES DO SISTEMA</w:t>
       </w:r>
@@ -15109,7 +15179,7 @@
           <w:noProof/>
         </w:rPr>
         <w:drawing>
-          <wp:inline distT="0" distB="0" distL="0" distR="0">
+          <wp:inline distT="0" distB="0" distL="0" distR="0" wp14:anchorId="28EA3EB3" wp14:editId="3D740FA7">
             <wp:extent cx="5133975" cy="5886450"/>
             <wp:effectExtent l="0" t="0" r="9525" b="0"/>
             <wp:docPr id="179649708" name="Imagem 1"/>
@@ -15171,7 +15241,7 @@
       <w:pPr>
         <w:pStyle w:val="Ttulo2"/>
       </w:pPr>
-      <w:bookmarkStart w:id="7" w:name="_Toc225289731"/>
+      <w:bookmarkStart w:id="7" w:name="_Toc226307821"/>
       <w:r>
         <w:t xml:space="preserve">4.1 </w:t>
       </w:r>
@@ -15927,7 +15997,7 @@
       <w:pPr>
         <w:pStyle w:val="Ttulo2"/>
       </w:pPr>
-      <w:bookmarkStart w:id="8" w:name="_Toc225289732"/>
+      <w:bookmarkStart w:id="8" w:name="_Toc226307822"/>
       <w:r>
         <w:t xml:space="preserve">4.2 </w:t>
       </w:r>
@@ -16533,7 +16603,7 @@
       <w:pPr>
         <w:pStyle w:val="Ttulo2"/>
       </w:pPr>
-      <w:bookmarkStart w:id="9" w:name="_Toc225289733"/>
+      <w:bookmarkStart w:id="9" w:name="_Toc226307823"/>
       <w:r>
         <w:t xml:space="preserve">4.3 </w:t>
       </w:r>
@@ -17276,7 +17346,7 @@
       <w:pPr>
         <w:pStyle w:val="Ttulo2"/>
       </w:pPr>
-      <w:bookmarkStart w:id="10" w:name="_Toc225289734"/>
+      <w:bookmarkStart w:id="10" w:name="_Toc226307824"/>
       <w:r>
         <w:t xml:space="preserve">4.4 </w:t>
       </w:r>
@@ -17900,7 +17970,7 @@
       <w:pPr>
         <w:pStyle w:val="Ttulo2"/>
       </w:pPr>
-      <w:bookmarkStart w:id="11" w:name="_Toc225289735"/>
+      <w:bookmarkStart w:id="11" w:name="_Toc226307825"/>
       <w:r>
         <w:t xml:space="preserve">4.5 </w:t>
       </w:r>
@@ -18502,7 +18572,7 @@
       <w:pPr>
         <w:pStyle w:val="Ttulo2"/>
       </w:pPr>
-      <w:bookmarkStart w:id="12" w:name="_Toc225289736"/>
+      <w:bookmarkStart w:id="12" w:name="_Toc226307826"/>
       <w:r>
         <w:t xml:space="preserve">4.6 </w:t>
       </w:r>
@@ -18968,7 +19038,7 @@
       <w:pPr>
         <w:pStyle w:val="Ttulo2"/>
       </w:pPr>
-      <w:bookmarkStart w:id="13" w:name="_Toc225289737"/>
+      <w:bookmarkStart w:id="13" w:name="_Toc226307827"/>
       <w:r>
         <w:t xml:space="preserve">4.7 </w:t>
       </w:r>
@@ -19429,7 +19499,7 @@
       <w:pPr>
         <w:pStyle w:val="Ttulo1"/>
       </w:pPr>
-      <w:bookmarkStart w:id="14" w:name="_Toc225289738"/>
+      <w:bookmarkStart w:id="14" w:name="_Toc226307828"/>
       <w:r>
         <w:t>5 DESCRIÇÃO DOS MÓDULOS</w:t>
       </w:r>
@@ -20074,74 +20144,12 @@
           <w:rFonts w:ascii="Arial" w:hAnsi="Arial" w:cs="Arial"/>
         </w:rPr>
       </w:pPr>
-      <w:r>
-        <w:rPr>
-          <w:noProof/>
-        </w:rPr>
-        <w:drawing>
-          <wp:inline distT="0" distB="0" distL="0" distR="0">
-            <wp:extent cx="5972175" cy="7740015"/>
-            <wp:effectExtent l="0" t="0" r="9525" b="0"/>
-            <wp:docPr id="1892546212" name="Imagem 2"/>
-            <wp:cNvGraphicFramePr>
-              <a:graphicFrameLocks xmlns:a="http://schemas.openxmlformats.org/drawingml/2006/main" noChangeAspect="1"/>
-            </wp:cNvGraphicFramePr>
-            <a:graphic xmlns:a="http://schemas.openxmlformats.org/drawingml/2006/main">
-              <a:graphicData uri="http://schemas.openxmlformats.org/drawingml/2006/picture">
-                <pic:pic xmlns:pic="http://schemas.openxmlformats.org/drawingml/2006/picture">
-                  <pic:nvPicPr>
-                    <pic:cNvPr id="0" name="Picture 3"/>
-                    <pic:cNvPicPr>
-                      <a:picLocks noChangeAspect="1" noChangeArrowheads="1"/>
-                    </pic:cNvPicPr>
-                  </pic:nvPicPr>
-                  <pic:blipFill>
-                    <a:blip r:embed="rId9">
-                      <a:extLst>
-                        <a:ext uri="{28A0092B-C50C-407E-A947-70E740481C1C}">
-                          <a14:useLocalDpi xmlns:a14="http://schemas.microsoft.com/office/drawing/2010/main" val="0"/>
-                        </a:ext>
-                      </a:extLst>
-                    </a:blip>
-                    <a:srcRect/>
-                    <a:stretch>
-                      <a:fillRect/>
-                    </a:stretch>
-                  </pic:blipFill>
-                  <pic:spPr bwMode="auto">
-                    <a:xfrm>
-                      <a:off x="0" y="0"/>
-                      <a:ext cx="5972175" cy="7740015"/>
-                    </a:xfrm>
-                    <a:prstGeom prst="rect">
-                      <a:avLst/>
-                    </a:prstGeom>
-                    <a:noFill/>
-                    <a:ln>
-                      <a:noFill/>
-                    </a:ln>
-                  </pic:spPr>
-                </pic:pic>
-              </a:graphicData>
-            </a:graphic>
-          </wp:inline>
-        </w:drawing>
-      </w:r>
     </w:p>
     <w:p>
       <w:pPr>
-        <w:ind w:firstLine="0"/>
-        <w:jc w:val="both"/>
-        <w:rPr>
-          <w:rFonts w:ascii="Arial" w:hAnsi="Arial" w:cs="Arial"/>
-        </w:rPr>
-      </w:pPr>
-    </w:p>
-    <w:p>
-      <w:pPr>
         <w:pStyle w:val="Ttulo2"/>
       </w:pPr>
-      <w:bookmarkStart w:id="15" w:name="_Toc225289739"/>
+      <w:bookmarkStart w:id="15" w:name="_Toc226307829"/>
       <w:r>
         <w:t xml:space="preserve">5.1 </w:t>
       </w:r>
@@ -21055,7 +21063,7 @@
       <w:pPr>
         <w:pStyle w:val="Ttulo2"/>
       </w:pPr>
-      <w:bookmarkStart w:id="16" w:name="_Toc225289740"/>
+      <w:bookmarkStart w:id="16" w:name="_Toc226307830"/>
       <w:r>
         <w:t xml:space="preserve">5.2 </w:t>
       </w:r>
@@ -21772,6 +21780,7 @@
         <w:rPr>
           <w:rFonts w:ascii="Arial" w:hAnsi="Arial" w:cs="Arial"/>
         </w:rPr>
+        <w:lastRenderedPageBreak/>
         <w:t>Gerenciamento</w:t>
       </w:r>
       <w:proofErr w:type="spellEnd"/>
@@ -22085,7 +22094,7 @@
       <w:pPr>
         <w:pStyle w:val="Ttulo2"/>
       </w:pPr>
-      <w:bookmarkStart w:id="17" w:name="_Toc225289741"/>
+      <w:bookmarkStart w:id="17" w:name="_Toc226307831"/>
       <w:r>
         <w:t xml:space="preserve">5.3 </w:t>
       </w:r>
@@ -22932,7 +22941,7 @@
       <w:pPr>
         <w:pStyle w:val="Ttulo2"/>
       </w:pPr>
-      <w:bookmarkStart w:id="18" w:name="_Toc225289742"/>
+      <w:bookmarkStart w:id="18" w:name="_Toc226307832"/>
       <w:r>
         <w:t xml:space="preserve">5.4 </w:t>
       </w:r>
@@ -23150,6 +23159,7 @@
         <w:rPr>
           <w:rFonts w:ascii="Arial" w:hAnsi="Arial" w:cs="Arial"/>
         </w:rPr>
+        <w:lastRenderedPageBreak/>
         <w:t xml:space="preserve">Esse </w:t>
       </w:r>
       <w:proofErr w:type="spellStart"/>
@@ -23794,7 +23804,7 @@
       <w:pPr>
         <w:pStyle w:val="Ttulo2"/>
       </w:pPr>
-      <w:bookmarkStart w:id="19" w:name="_Toc225289743"/>
+      <w:bookmarkStart w:id="19" w:name="_Toc226307833"/>
       <w:r>
         <w:t xml:space="preserve">5.5 </w:t>
       </w:r>
@@ -24567,7 +24577,7 @@
       <w:pPr>
         <w:pStyle w:val="Ttulo2"/>
       </w:pPr>
-      <w:bookmarkStart w:id="20" w:name="_Toc225289744"/>
+      <w:bookmarkStart w:id="20" w:name="_Toc226307834"/>
       <w:r>
         <w:t xml:space="preserve">5.6 </w:t>
       </w:r>
@@ -24615,6 +24625,7 @@
         <w:rPr>
           <w:rFonts w:ascii="Arial" w:hAnsi="Arial" w:cs="Arial"/>
         </w:rPr>
+        <w:lastRenderedPageBreak/>
         <w:t xml:space="preserve">O </w:t>
       </w:r>
       <w:r>
@@ -24751,7 +24762,6 @@
         <w:rPr>
           <w:rFonts w:ascii="Arial" w:hAnsi="Arial" w:cs="Arial"/>
         </w:rPr>
-        <w:lastRenderedPageBreak/>
         <w:t xml:space="preserve">Entre esses </w:t>
       </w:r>
       <w:proofErr w:type="spellStart"/>
@@ -25402,7 +25412,7 @@
       <w:pPr>
         <w:pStyle w:val="Ttulo2"/>
       </w:pPr>
-      <w:bookmarkStart w:id="21" w:name="_Toc225289745"/>
+      <w:bookmarkStart w:id="21" w:name="_Toc226307835"/>
       <w:r>
         <w:t xml:space="preserve">5.7 </w:t>
       </w:r>
@@ -26203,9 +26213,8 @@
       <w:pPr>
         <w:pStyle w:val="Ttulo1"/>
       </w:pPr>
-      <w:bookmarkStart w:id="22" w:name="_Toc225289746"/>
-      <w:r>
-        <w:lastRenderedPageBreak/>
+      <w:bookmarkStart w:id="22" w:name="_Toc226307836"/>
+      <w:r>
         <w:t xml:space="preserve">6 FLUXO DE EXECUÇÃO DA </w:t>
       </w:r>
       <w:r>
@@ -27270,7 +27279,7 @@
       <w:pPr>
         <w:pStyle w:val="Ttulo2"/>
       </w:pPr>
-      <w:bookmarkStart w:id="23" w:name="_Toc225289747"/>
+      <w:bookmarkStart w:id="23" w:name="_Toc226307837"/>
       <w:r>
         <w:t xml:space="preserve">6.1 </w:t>
       </w:r>
@@ -28118,8 +28127,9 @@
       <w:pPr>
         <w:pStyle w:val="Ttulo2"/>
       </w:pPr>
-      <w:bookmarkStart w:id="24" w:name="_Toc225289748"/>
-      <w:r>
+      <w:bookmarkStart w:id="24" w:name="_Toc226307838"/>
+      <w:r>
+        <w:lastRenderedPageBreak/>
         <w:t xml:space="preserve">6.2 </w:t>
       </w:r>
       <w:proofErr w:type="spellStart"/>
@@ -28153,7 +28163,6 @@
         <w:rPr>
           <w:rFonts w:ascii="Arial" w:hAnsi="Arial" w:cs="Arial"/>
         </w:rPr>
-        <w:lastRenderedPageBreak/>
         <w:t xml:space="preserve">Durante </w:t>
       </w:r>
       <w:proofErr w:type="spellStart"/>
@@ -28732,7 +28741,7 @@
       <w:pPr>
         <w:pStyle w:val="Ttulo2"/>
       </w:pPr>
-      <w:bookmarkStart w:id="25" w:name="_Toc225289749"/>
+      <w:bookmarkStart w:id="25" w:name="_Toc226307839"/>
       <w:r>
         <w:t xml:space="preserve">6.3 </w:t>
       </w:r>
@@ -29447,7 +29456,7 @@
       <w:pPr>
         <w:pStyle w:val="Ttulo2"/>
       </w:pPr>
-      <w:bookmarkStart w:id="26" w:name="_Toc225289750"/>
+      <w:bookmarkStart w:id="26" w:name="_Toc226307840"/>
       <w:r>
         <w:t xml:space="preserve">6.4 </w:t>
       </w:r>
@@ -29488,6 +29497,7 @@
         <w:rPr>
           <w:rFonts w:ascii="Arial" w:hAnsi="Arial" w:cs="Arial"/>
         </w:rPr>
+        <w:lastRenderedPageBreak/>
         <w:t>Após</w:t>
       </w:r>
       <w:proofErr w:type="spellEnd"/>
@@ -29997,7 +30007,7 @@
       <w:pPr>
         <w:pStyle w:val="Ttulo2"/>
       </w:pPr>
-      <w:bookmarkStart w:id="27" w:name="_Toc225289751"/>
+      <w:bookmarkStart w:id="27" w:name="_Toc226307841"/>
       <w:r>
         <w:t xml:space="preserve">6.5 </w:t>
       </w:r>
@@ -30762,7 +30772,7 @@
       <w:pPr>
         <w:pStyle w:val="Ttulo2"/>
       </w:pPr>
-      <w:bookmarkStart w:id="28" w:name="_Toc225289752"/>
+      <w:bookmarkStart w:id="28" w:name="_Toc226307842"/>
       <w:r>
         <w:t xml:space="preserve">6.6 </w:t>
       </w:r>
@@ -31257,16 +31267,11 @@
       <w:pPr>
         <w:pStyle w:val="Ttulo1"/>
       </w:pPr>
-      <w:bookmarkStart w:id="29" w:name="_Toc225289753"/>
-      <w:r>
-        <w:t xml:space="preserve">7 </w:t>
-      </w:r>
-      <w:proofErr w:type="spellStart"/>
-      <w:r>
-        <w:t>Diagramas</w:t>
+      <w:bookmarkStart w:id="29" w:name="_Toc226307843"/>
+      <w:r>
+        <w:t>7 Diagramas</w:t>
       </w:r>
       <w:bookmarkEnd w:id="29"/>
-      <w:proofErr w:type="spellEnd"/>
     </w:p>
     <w:p>
       <w:pPr>
@@ -31279,9 +31284,354 @@
     </w:p>
     <w:p>
       <w:pPr>
+        <w:ind w:firstLine="0"/>
+        <w:jc w:val="both"/>
+        <w:rPr>
+          <w:rFonts w:ascii="Arial" w:hAnsi="Arial" w:cs="Arial"/>
+        </w:rPr>
+      </w:pPr>
+      <w:proofErr w:type="spellStart"/>
+      <w:r>
+        <w:rPr>
+          <w:rFonts w:ascii="Arial" w:hAnsi="Arial" w:cs="Arial"/>
+        </w:rPr>
+        <w:lastRenderedPageBreak/>
+        <w:t>O</w:t>
+      </w:r>
+      <w:r>
+        <w:rPr>
+          <w:rFonts w:ascii="Arial" w:hAnsi="Arial" w:cs="Arial"/>
+        </w:rPr>
+        <w:t>s</w:t>
+      </w:r>
+      <w:proofErr w:type="spellEnd"/>
+      <w:r>
+        <w:rPr>
+          <w:rFonts w:ascii="Arial" w:hAnsi="Arial" w:cs="Arial"/>
+        </w:rPr>
+        <w:t xml:space="preserve"> </w:t>
+      </w:r>
+      <w:proofErr w:type="spellStart"/>
+      <w:r>
+        <w:rPr>
+          <w:rFonts w:ascii="Arial" w:hAnsi="Arial" w:cs="Arial"/>
+        </w:rPr>
+        <w:t>diagrama</w:t>
+      </w:r>
+      <w:r>
+        <w:rPr>
+          <w:rFonts w:ascii="Arial" w:hAnsi="Arial" w:cs="Arial"/>
+        </w:rPr>
+        <w:t>s</w:t>
+      </w:r>
+      <w:proofErr w:type="spellEnd"/>
+      <w:r>
+        <w:rPr>
+          <w:rFonts w:ascii="Arial" w:hAnsi="Arial" w:cs="Arial"/>
+        </w:rPr>
+        <w:t xml:space="preserve"> </w:t>
+      </w:r>
+      <w:proofErr w:type="spellStart"/>
+      <w:r>
+        <w:rPr>
+          <w:rFonts w:ascii="Arial" w:hAnsi="Arial" w:cs="Arial"/>
+        </w:rPr>
+        <w:t>fo</w:t>
+      </w:r>
+      <w:r>
+        <w:rPr>
+          <w:rFonts w:ascii="Arial" w:hAnsi="Arial" w:cs="Arial"/>
+        </w:rPr>
+        <w:t>ram</w:t>
+      </w:r>
+      <w:proofErr w:type="spellEnd"/>
+      <w:r>
+        <w:rPr>
+          <w:rFonts w:ascii="Arial" w:hAnsi="Arial" w:cs="Arial"/>
+        </w:rPr>
+        <w:t xml:space="preserve"> </w:t>
+      </w:r>
+      <w:proofErr w:type="spellStart"/>
+      <w:r>
+        <w:rPr>
+          <w:rFonts w:ascii="Arial" w:hAnsi="Arial" w:cs="Arial"/>
+        </w:rPr>
+        <w:t>estruturado</w:t>
+      </w:r>
+      <w:proofErr w:type="spellEnd"/>
+      <w:r>
+        <w:rPr>
+          <w:rFonts w:ascii="Arial" w:hAnsi="Arial" w:cs="Arial"/>
+        </w:rPr>
+        <w:t xml:space="preserve"> </w:t>
+      </w:r>
+      <w:proofErr w:type="spellStart"/>
+      <w:r>
+        <w:rPr>
+          <w:rFonts w:ascii="Arial" w:hAnsi="Arial" w:cs="Arial"/>
+        </w:rPr>
+        <w:t>seguindo</w:t>
+      </w:r>
+      <w:proofErr w:type="spellEnd"/>
+      <w:r>
+        <w:rPr>
+          <w:rFonts w:ascii="Arial" w:hAnsi="Arial" w:cs="Arial"/>
+        </w:rPr>
+        <w:t xml:space="preserve"> </w:t>
+      </w:r>
+      <w:proofErr w:type="spellStart"/>
+      <w:r>
+        <w:rPr>
+          <w:rFonts w:ascii="Arial" w:hAnsi="Arial" w:cs="Arial"/>
+        </w:rPr>
+        <w:t>os</w:t>
+      </w:r>
+      <w:proofErr w:type="spellEnd"/>
+      <w:r>
+        <w:rPr>
+          <w:rFonts w:ascii="Arial" w:hAnsi="Arial" w:cs="Arial"/>
+        </w:rPr>
+        <w:t xml:space="preserve"> </w:t>
+      </w:r>
+      <w:proofErr w:type="spellStart"/>
+      <w:r>
+        <w:rPr>
+          <w:rFonts w:ascii="Arial" w:hAnsi="Arial" w:cs="Arial"/>
+        </w:rPr>
+        <w:t>princípios</w:t>
+      </w:r>
+      <w:proofErr w:type="spellEnd"/>
+      <w:r>
+        <w:rPr>
+          <w:rFonts w:ascii="Arial" w:hAnsi="Arial" w:cs="Arial"/>
+        </w:rPr>
+        <w:t xml:space="preserve"> de </w:t>
+      </w:r>
+      <w:proofErr w:type="spellStart"/>
+      <w:r>
+        <w:rPr>
+          <w:rFonts w:ascii="Arial" w:hAnsi="Arial" w:cs="Arial"/>
+        </w:rPr>
+        <w:t>baixo</w:t>
+      </w:r>
+      <w:proofErr w:type="spellEnd"/>
+      <w:r>
+        <w:rPr>
+          <w:rFonts w:ascii="Arial" w:hAnsi="Arial" w:cs="Arial"/>
+        </w:rPr>
+        <w:t xml:space="preserve"> </w:t>
+      </w:r>
+      <w:proofErr w:type="spellStart"/>
+      <w:r>
+        <w:rPr>
+          <w:rFonts w:ascii="Arial" w:hAnsi="Arial" w:cs="Arial"/>
+        </w:rPr>
+        <w:t>acoplamento</w:t>
+      </w:r>
+      <w:proofErr w:type="spellEnd"/>
+      <w:r>
+        <w:rPr>
+          <w:rFonts w:ascii="Arial" w:hAnsi="Arial" w:cs="Arial"/>
+        </w:rPr>
+        <w:t xml:space="preserve"> e </w:t>
+      </w:r>
+      <w:proofErr w:type="spellStart"/>
+      <w:r>
+        <w:rPr>
+          <w:rFonts w:ascii="Arial" w:hAnsi="Arial" w:cs="Arial"/>
+        </w:rPr>
+        <w:t>responsabilidade</w:t>
+      </w:r>
+      <w:proofErr w:type="spellEnd"/>
+      <w:r>
+        <w:rPr>
+          <w:rFonts w:ascii="Arial" w:hAnsi="Arial" w:cs="Arial"/>
+        </w:rPr>
+        <w:t xml:space="preserve"> </w:t>
+      </w:r>
+      <w:proofErr w:type="spellStart"/>
+      <w:r>
+        <w:rPr>
+          <w:rFonts w:ascii="Arial" w:hAnsi="Arial" w:cs="Arial"/>
+        </w:rPr>
+        <w:t>única</w:t>
+      </w:r>
+      <w:proofErr w:type="spellEnd"/>
+      <w:r>
+        <w:rPr>
+          <w:rFonts w:ascii="Arial" w:hAnsi="Arial" w:cs="Arial"/>
+        </w:rPr>
+        <w:t xml:space="preserve">, </w:t>
+      </w:r>
+      <w:proofErr w:type="spellStart"/>
+      <w:r>
+        <w:rPr>
+          <w:rFonts w:ascii="Arial" w:hAnsi="Arial" w:cs="Arial"/>
+        </w:rPr>
+        <w:t>utilizando</w:t>
+      </w:r>
+      <w:proofErr w:type="spellEnd"/>
+      <w:r>
+        <w:rPr>
+          <w:rFonts w:ascii="Arial" w:hAnsi="Arial" w:cs="Arial"/>
+        </w:rPr>
+        <w:t xml:space="preserve"> </w:t>
+      </w:r>
+      <w:proofErr w:type="spellStart"/>
+      <w:r>
+        <w:rPr>
+          <w:rFonts w:ascii="Arial" w:hAnsi="Arial" w:cs="Arial"/>
+        </w:rPr>
+        <w:t>composição</w:t>
+      </w:r>
+      <w:proofErr w:type="spellEnd"/>
+      <w:r>
+        <w:rPr>
+          <w:rFonts w:ascii="Arial" w:hAnsi="Arial" w:cs="Arial"/>
+        </w:rPr>
+        <w:t xml:space="preserve"> para </w:t>
+      </w:r>
+      <w:proofErr w:type="spellStart"/>
+      <w:r>
+        <w:rPr>
+          <w:rFonts w:ascii="Arial" w:hAnsi="Arial" w:cs="Arial"/>
+        </w:rPr>
+        <w:t>representar</w:t>
+      </w:r>
+      <w:proofErr w:type="spellEnd"/>
+      <w:r>
+        <w:rPr>
+          <w:rFonts w:ascii="Arial" w:hAnsi="Arial" w:cs="Arial"/>
+        </w:rPr>
+        <w:t xml:space="preserve"> </w:t>
+      </w:r>
+      <w:proofErr w:type="spellStart"/>
+      <w:r>
+        <w:rPr>
+          <w:rFonts w:ascii="Arial" w:hAnsi="Arial" w:cs="Arial"/>
+        </w:rPr>
+        <w:t>dependência</w:t>
+      </w:r>
+      <w:proofErr w:type="spellEnd"/>
+      <w:r>
+        <w:rPr>
+          <w:rFonts w:ascii="Arial" w:hAnsi="Arial" w:cs="Arial"/>
+        </w:rPr>
+        <w:t xml:space="preserve"> forte e </w:t>
+      </w:r>
+      <w:proofErr w:type="spellStart"/>
+      <w:r>
+        <w:rPr>
+          <w:rFonts w:ascii="Arial" w:hAnsi="Arial" w:cs="Arial"/>
+        </w:rPr>
+        <w:t>associação</w:t>
+      </w:r>
+      <w:proofErr w:type="spellEnd"/>
+      <w:r>
+        <w:rPr>
+          <w:rFonts w:ascii="Arial" w:hAnsi="Arial" w:cs="Arial"/>
+        </w:rPr>
+        <w:t xml:space="preserve"> para </w:t>
+      </w:r>
+      <w:proofErr w:type="spellStart"/>
+      <w:r>
+        <w:rPr>
+          <w:rFonts w:ascii="Arial" w:hAnsi="Arial" w:cs="Arial"/>
+        </w:rPr>
+        <w:t>relações</w:t>
+      </w:r>
+      <w:proofErr w:type="spellEnd"/>
+      <w:r>
+        <w:rPr>
+          <w:rFonts w:ascii="Arial" w:hAnsi="Arial" w:cs="Arial"/>
+        </w:rPr>
+        <w:t xml:space="preserve"> </w:t>
+      </w:r>
+      <w:proofErr w:type="spellStart"/>
+      <w:r>
+        <w:rPr>
+          <w:rFonts w:ascii="Arial" w:hAnsi="Arial" w:cs="Arial"/>
+        </w:rPr>
+        <w:t>mais</w:t>
+      </w:r>
+      <w:proofErr w:type="spellEnd"/>
+      <w:r>
+        <w:rPr>
+          <w:rFonts w:ascii="Arial" w:hAnsi="Arial" w:cs="Arial"/>
+        </w:rPr>
+        <w:t xml:space="preserve"> </w:t>
+      </w:r>
+      <w:proofErr w:type="spellStart"/>
+      <w:r>
+        <w:rPr>
+          <w:rFonts w:ascii="Arial" w:hAnsi="Arial" w:cs="Arial"/>
+        </w:rPr>
+        <w:t>flexíveis</w:t>
+      </w:r>
+      <w:proofErr w:type="spellEnd"/>
+      <w:r>
+        <w:rPr>
+          <w:rFonts w:ascii="Arial" w:hAnsi="Arial" w:cs="Arial"/>
+        </w:rPr>
+        <w:t xml:space="preserve">, </w:t>
+      </w:r>
+      <w:proofErr w:type="spellStart"/>
+      <w:r>
+        <w:rPr>
+          <w:rFonts w:ascii="Arial" w:hAnsi="Arial" w:cs="Arial"/>
+        </w:rPr>
+        <w:t>conforme</w:t>
+      </w:r>
+      <w:proofErr w:type="spellEnd"/>
+      <w:r>
+        <w:rPr>
+          <w:rFonts w:ascii="Arial" w:hAnsi="Arial" w:cs="Arial"/>
+        </w:rPr>
+        <w:t xml:space="preserve"> a </w:t>
+      </w:r>
+      <w:proofErr w:type="spellStart"/>
+      <w:r>
+        <w:rPr>
+          <w:rFonts w:ascii="Arial" w:hAnsi="Arial" w:cs="Arial"/>
+        </w:rPr>
+        <w:t>notação</w:t>
+      </w:r>
+      <w:proofErr w:type="spellEnd"/>
+      <w:r>
+        <w:rPr>
+          <w:rFonts w:ascii="Arial" w:hAnsi="Arial" w:cs="Arial"/>
+        </w:rPr>
+        <w:t xml:space="preserve"> </w:t>
+      </w:r>
+      <w:proofErr w:type="spellStart"/>
+      <w:r>
+        <w:rPr>
+          <w:rFonts w:ascii="Arial" w:hAnsi="Arial" w:cs="Arial"/>
+        </w:rPr>
+        <w:t>padrão</w:t>
+      </w:r>
+      <w:proofErr w:type="spellEnd"/>
+      <w:r>
+        <w:rPr>
+          <w:rFonts w:ascii="Arial" w:hAnsi="Arial" w:cs="Arial"/>
+        </w:rPr>
+        <w:t xml:space="preserve"> da UML.</w:t>
+      </w:r>
+    </w:p>
+    <w:p>
+      <w:pPr>
+        <w:ind w:firstLine="0"/>
+        <w:jc w:val="both"/>
+        <w:rPr>
+          <w:rFonts w:ascii="Arial" w:hAnsi="Arial" w:cs="Arial"/>
+        </w:rPr>
+      </w:pPr>
+    </w:p>
+    <w:p>
+      <w:pPr>
         <w:pStyle w:val="Ttulo2"/>
       </w:pPr>
-      <w:bookmarkStart w:id="30" w:name="_Toc225289754"/>
+      <w:bookmarkStart w:id="30" w:name="_Toc226307844"/>
       <w:r>
         <w:t>7.1 Caso de Uso</w:t>
       </w:r>
@@ -31308,9 +31658,8 @@
         <w:rPr>
           <w:noProof/>
         </w:rPr>
-        <w:lastRenderedPageBreak/>
         <w:drawing>
-          <wp:inline distT="0" distB="0" distL="0" distR="0">
+          <wp:inline distT="0" distB="0" distL="0" distR="0" wp14:anchorId="180E6AA3" wp14:editId="7C1DC082">
             <wp:extent cx="5972175" cy="2000250"/>
             <wp:effectExtent l="0" t="0" r="9525" b="0"/>
             <wp:docPr id="1368628163" name="Imagem 2"/>
@@ -31327,7 +31676,7 @@
                     </pic:cNvPicPr>
                   </pic:nvPicPr>
                   <pic:blipFill>
-                    <a:blip r:embed="rId10">
+                    <a:blip r:embed="rId9">
                       <a:extLst>
                         <a:ext uri="{28A0092B-C50C-407E-A947-70E740481C1C}">
                           <a14:useLocalDpi xmlns:a14="http://schemas.microsoft.com/office/drawing/2010/main" val="0"/>
@@ -31367,6 +31716,102 @@
           <w:rFonts w:ascii="Arial" w:hAnsi="Arial" w:cs="Arial"/>
         </w:rPr>
       </w:pPr>
+    </w:p>
+    <w:p>
+      <w:pPr>
+        <w:ind w:firstLine="0"/>
+        <w:jc w:val="both"/>
+        <w:rPr>
+          <w:rFonts w:ascii="Arial" w:hAnsi="Arial" w:cs="Arial"/>
+        </w:rPr>
+      </w:pPr>
+    </w:p>
+    <w:p>
+      <w:pPr>
+        <w:pStyle w:val="Ttulo2"/>
+      </w:pPr>
+      <w:bookmarkStart w:id="31" w:name="_Toc226307845"/>
+      <w:r>
+        <w:t xml:space="preserve">7.1 Classe e </w:t>
+      </w:r>
+      <w:proofErr w:type="spellStart"/>
+      <w:r>
+        <w:t>Relacionamento</w:t>
+      </w:r>
+      <w:bookmarkEnd w:id="31"/>
+      <w:proofErr w:type="spellEnd"/>
+    </w:p>
+    <w:p>
+      <w:pPr>
+        <w:ind w:firstLine="0"/>
+        <w:jc w:val="both"/>
+        <w:rPr>
+          <w:rFonts w:ascii="Arial" w:hAnsi="Arial" w:cs="Arial"/>
+        </w:rPr>
+      </w:pPr>
+    </w:p>
+    <w:p>
+      <w:pPr>
+        <w:ind w:firstLine="0"/>
+        <w:jc w:val="both"/>
+        <w:rPr>
+          <w:rFonts w:ascii="Arial" w:hAnsi="Arial" w:cs="Arial"/>
+        </w:rPr>
+      </w:pPr>
+      <w:r>
+        <w:rPr>
+          <w:noProof/>
+        </w:rPr>
+        <w:lastRenderedPageBreak/>
+        <w:drawing>
+          <wp:inline distT="0" distB="0" distL="0" distR="0" wp14:anchorId="5D5643B9" wp14:editId="23268316">
+            <wp:extent cx="5972175" cy="6012815"/>
+            <wp:effectExtent l="0" t="0" r="9525" b="6985"/>
+            <wp:docPr id="1583787537" name="Imagem 1"/>
+            <wp:cNvGraphicFramePr>
+              <a:graphicFrameLocks xmlns:a="http://schemas.openxmlformats.org/drawingml/2006/main" noChangeAspect="1"/>
+            </wp:cNvGraphicFramePr>
+            <a:graphic xmlns:a="http://schemas.openxmlformats.org/drawingml/2006/main">
+              <a:graphicData uri="http://schemas.openxmlformats.org/drawingml/2006/picture">
+                <pic:pic xmlns:pic="http://schemas.openxmlformats.org/drawingml/2006/picture">
+                  <pic:nvPicPr>
+                    <pic:cNvPr id="0" name="Picture 1"/>
+                    <pic:cNvPicPr>
+                      <a:picLocks noChangeAspect="1" noChangeArrowheads="1"/>
+                    </pic:cNvPicPr>
+                  </pic:nvPicPr>
+                  <pic:blipFill>
+                    <a:blip r:embed="rId10">
+                      <a:extLst>
+                        <a:ext uri="{28A0092B-C50C-407E-A947-70E740481C1C}">
+                          <a14:useLocalDpi xmlns:a14="http://schemas.microsoft.com/office/drawing/2010/main" val="0"/>
+                        </a:ext>
+                      </a:extLst>
+                    </a:blip>
+                    <a:srcRect/>
+                    <a:stretch>
+                      <a:fillRect/>
+                    </a:stretch>
+                  </pic:blipFill>
+                  <pic:spPr bwMode="auto">
+                    <a:xfrm>
+                      <a:off x="0" y="0"/>
+                      <a:ext cx="5972175" cy="6012815"/>
+                    </a:xfrm>
+                    <a:prstGeom prst="rect">
+                      <a:avLst/>
+                    </a:prstGeom>
+                    <a:noFill/>
+                    <a:ln>
+                      <a:noFill/>
+                    </a:ln>
+                  </pic:spPr>
+                </pic:pic>
+              </a:graphicData>
+            </a:graphic>
+          </wp:inline>
+        </w:drawing>
+      </w:r>
     </w:p>
     <w:p>
       <w:pPr>

</xml_diff>